<commit_message>
v431.0.0: Fachrouten, Aktenqualitaet und Versandwerkstatt abschliessen
</commit_message>
<xml_diff>
--- a/testakten/erbrecht-pflichtteilsergaenzung-niesbrauch-depot-sylt/01_mandatsnotiz_erstgespraech.docx
+++ b/testakten/erbrecht-pflichtteilsergaenzung-niesbrauch-depot-sylt/01_mandatsnotiz_erstgespraech.docx
@@ -4,94 +4,229 @@
   <w:body>
     <w:p>
       <w:pPr>
-        <w:pStyle w:val="Heading1"/>
+        <w:spacing w:after="40"/>
       </w:pPr>
       <w:r>
-        <w:t>Mandatsnotiz Erstgespräch</w:t>
+        <w:rPr>
+          <w:rFonts w:ascii="Arial" w:hAnsi="Arial"/>
+          <w:b/>
+          <w:color w:val="17365D"/>
+          <w:sz w:val="17"/>
+        </w:rPr>
+        <w:t>KANZLEIVERMERK</w:t>
       </w:r>
     </w:p>
     <w:p>
       <w:pPr>
-        <w:pStyle w:val="Heading2"/>
+        <w:spacing w:after="40"/>
       </w:pPr>
       <w:r>
-        <w:t>1. Ausgangspunkt</w:t>
-      </w:r>
-    </w:p>
-    <w:p>
-      <w:r>
-        <w:t>Helga übertrug 2018 das Haus in Keitum auf Karsten, behielt sich lebenslangen Nießbrauch und Wohnrecht vor.</w:t>
-      </w:r>
-    </w:p>
-    <w:p>
-      <w:r>
-        <w:t>Karsten behauptet erhebliche Pflegeleistungen und Investitionen in Dach und Heizung.</w:t>
-      </w:r>
-    </w:p>
-    <w:p>
-      <w:r>
-        <w:t>Anja sieht eine nahezu vollständige wirtschaftliche Beibehaltung der Nutzung bei der Erblasserin.</w:t>
+        <w:rPr>
+          <w:rFonts w:ascii="Arial" w:hAnsi="Arial"/>
+          <w:b/>
+          <w:sz w:val="25"/>
+        </w:rPr>
+        <w:t>Petersen &amp; Hagedorn Rechtsanwälte</w:t>
       </w:r>
     </w:p>
     <w:p>
       <w:pPr>
-        <w:pStyle w:val="Heading2"/>
+        <w:spacing w:after="200"/>
       </w:pPr>
       <w:r>
-        <w:t>2. Ziele und Dringlichkeit</w:t>
-      </w:r>
-    </w:p>
-    <w:p>
-      <w:r>
-        <w:t>Anja verlangt notarielles Nachlassverzeichnis und Wertermittlung.</w:t>
-      </w:r>
-    </w:p>
-    <w:p>
-      <w:r>
-        <w:t>Karsten verweist auf Zehnjahresfrist und Pflegeleistungen.</w:t>
-      </w:r>
-    </w:p>
-    <w:p>
-      <w:r>
-        <w:t>Theo will mit dem Streit nichts zu tun haben, ist aber Beschenkter.</w:t>
+        <w:rPr>
+          <w:rFonts w:ascii="Arial" w:hAnsi="Arial"/>
+          <w:color w:val="586069"/>
+          <w:sz w:val="17"/>
+        </w:rPr>
+        <w:t>Fachbereich Erbrecht | Friedrichstraße 21 | 25980 Sylt | Telefon 04651 882140</w:t>
       </w:r>
     </w:p>
     <w:p>
       <w:pPr>
-        <w:pStyle w:val="Heading2"/>
+        <w:spacing w:after="160"/>
       </w:pPr>
       <w:r>
-        <w:t>3. Offene Unterlagen</w:t>
+        <w:t>Intern - elektronische Handakte</w:t>
       </w:r>
     </w:p>
     <w:p>
+      <w:pPr>
+        <w:spacing w:after="80"/>
+      </w:pPr>
       <w:r>
-        <w:t>Notarielles Nachlassverzeichnis beantragen.</w:t>
+        <w:rPr>
+          <w:rFonts w:ascii="Arial" w:hAnsi="Arial"/>
+          <w:color w:val="586069"/>
+          <w:sz w:val="18"/>
+        </w:rPr>
+        <w:t>Datum: 29.06.2026  |  Zeichen: PMH/26-184 AM</w:t>
       </w:r>
     </w:p>
     <w:p>
+      <w:pPr>
+        <w:pStyle w:val="Title"/>
+      </w:pPr>
       <w:r>
-        <w:t>Nießbrauch und tatsächliche Nutzung anhand Vertrag und Konto prüfen.</w:t>
+        <w:t>Mandatsnotiz zum Nachlass Helga Martensen</w:t>
       </w:r>
     </w:p>
     <w:p>
+      <w:pPr>
+        <w:jc w:val="both"/>
+      </w:pPr>
       <w:r>
-        <w:t>Depotübertrag mit Erträgen und Rückflüssen rekonstruieren.</w:t>
+        <w:t>Anja Martensen erschien am 29. Juni 2026 persönlich. Sie legte die Sterbeurkunde ihrer Mutter, eine Kopie des privaten Nachlassverzeichnisses ihres Bruders Karsten und einen Ausdruck des Übertragungsvertrags aus dem Jahr 2018 vor. Das Gespräch dauerte von 09:10 Uhr bis 10:35 Uhr; die Mandantin bestätigte die nachstehende Sachverhaltserfassung.</w:t>
       </w:r>
     </w:p>
     <w:p>
+      <w:pPr>
+        <w:pStyle w:val="Heading1"/>
+      </w:pPr>
       <w:r>
-        <w:t>Ergänzung gegen Erben und Beschenkten getrennt vorbereiten.</w:t>
+        <w:t>1. Beteiligte und Mandatsziel</w:t>
+      </w:r>
+    </w:p>
+    <w:p>
+      <w:pPr>
+        <w:jc w:val="both"/>
+      </w:pPr>
+      <w:r>
+        <w:t>Helga Martensen, zuletzt wohnhaft im Gurtstig 18 in Keitum, verstarb am 14. Januar 2026. Nach dem eröffneten Einzeltestament vom 6. Mai 2022 ist Karsten Martensen Alleinerbe. Anja ist nicht bedacht. Enkel Theo Martensen erhielt im September 2021 ein Wertpapierdepot.</w:t>
+      </w:r>
+    </w:p>
+    <w:p>
+      <w:pPr>
+        <w:jc w:val="both"/>
+      </w:pPr>
+      <w:r>
+        <w:t>Die Mandantin verlangt zunächst vollständige Auskunft und eine belastbare Wertermittlung. Eine Zahlungsforderung soll erst nach Sichtung des notariellen Nachlassverzeichnisses, der Grundstücksakte und der Depotunterlagen beziffert werden. Ansprüche gegen den Erben und gegen einen Beschenkten sind getrennt zu erfassen.</w:t>
+      </w:r>
+    </w:p>
+    <w:p>
+      <w:pPr>
+        <w:pStyle w:val="Heading1"/>
+      </w:pPr>
+      <w:r>
+        <w:t>2. Schenkungen und tatsächliche Nutzung</w:t>
+      </w:r>
+    </w:p>
+    <w:p>
+      <w:pPr>
+        <w:jc w:val="both"/>
+      </w:pPr>
+      <w:r>
+        <w:t>Mit Urkunde 118/2018 der Notarin Dr. Ruth Behrends übertrug Helga das Grundstück Keitum Blatt 2187, Flur 18, Flurstück 77 auf Karsten. Nach Erinnerung Anjas blieb Helga bis Ende 2025 alleinige Nutzerin des Erdgeschosses, bestimmte über drei Ferienvermietungen im Obergeschoss und erhielt die Mieterlöse auf ihr Konto. Karsten bestreitet eine vollständige wirtschaftliche Herrschaft der Erblasserin und verweist auf eigene Sanierungsentscheidungen.</w:t>
+      </w:r>
+    </w:p>
+    <w:p>
+      <w:pPr>
+        <w:jc w:val="both"/>
+      </w:pPr>
+      <w:r>
+        <w:t>Am 18. September 2021 wurden Wertpapiere mit einem damaligen Kurswert von 312.460 Euro auf ein Depot Theos übertragen. Auf Helgas Girokonto gingen danach quartalsweise Beträge mit dem Verwendungszweck „Ertrag Depot T. M.“ ein. Ob dies auf einer Abrede, einem Nießbrauch oder freiwilligen Zahlungen beruhte, ist offen.</w:t>
+      </w:r>
+    </w:p>
+    <w:p>
+      <w:pPr>
+        <w:pStyle w:val="Heading1"/>
+      </w:pPr>
+      <w:r>
+        <w:t>3. Nachlass und Einwendungen</w:t>
+      </w:r>
+    </w:p>
+    <w:p>
+      <w:pPr>
+        <w:jc w:val="both"/>
+      </w:pPr>
+      <w:r>
+        <w:t>Das private Verzeichnis nennt Bankguthaben von 48.310 Euro, Hausrat pauschal mit 4.000 Euro, Schmuck mit 2.500 Euro und Bestattungskosten von 12.840 Euro. Es fehlen Kontoentwicklungen, Steuererstattungen, Rückzahlungsansprüche, Ferienmieten und Angaben zu Zuwendungen der letzten zehn Jahre. Karsten macht Pflegeleistungen sowie Dach-, Heizungs- und Malerkosten geltend; Belege liegen nur teilweise vor.</w:t>
+      </w:r>
+    </w:p>
+    <w:p>
+      <w:pPr>
+        <w:pStyle w:val="Heading1"/>
+      </w:pPr>
+      <w:r>
+        <w:t>4. Arbeitsauftrag und nächste Schritte</w:t>
+      </w:r>
+    </w:p>
+    <w:p>
+      <w:pPr>
+        <w:jc w:val="both"/>
+      </w:pPr>
+      <w:r>
+        <w:t>Bis 3. Juli 2026 werden Eröffnungsniederschrift, vollständiger Übertragungsvertrag, Grundbuchauszug, Kontoauszüge 2017 bis 2026, Depotauftrag 2021, Ertragsabrechnungen, Pflegeunterlagen und Handwerkerrechnungen angefordert. Die Verjährung wird für jeden Anspruch und jeden Gegner gesondert notiert. Eine bloße außergerichtliche Auskunftsaufforderung wird nicht als sichere Hemmungsmaßnahme behandelt.</w:t>
+      </w:r>
+    </w:p>
+    <w:p>
+      <w:pPr>
+        <w:jc w:val="both"/>
+      </w:pPr>
+      <w:r>
+        <w:t>Bearbeiterin: Rechtsanwältin Lea Petersen Mandantin erhält eine verschlüsselte Kopie der Unterlagenanforderung.</w:t>
       </w:r>
     </w:p>
     <w:sectPr>
-      <w:pgSz w:w="12240" w:h="15840"/>
-      <w:pgMar w:top="1440" w:right="1800" w:bottom="1440" w:left="1800" w:header="720" w:footer="720" w:gutter="0"/>
+      <w:headerReference w:type="default" r:id="rId9"/>
+      <w:footerReference w:type="default" r:id="rId10"/>
+      <w:pgSz w:w="11906" w:h="16838"/>
+      <w:pgMar w:top="1020" w:right="1134" w:bottom="1020" w:left="1417" w:header="454" w:footer="454" w:gutter="0"/>
       <w:cols w:space="720"/>
       <w:docGrid w:linePitch="360"/>
     </w:sectPr>
   </w:body>
 </w:document>
+</file>
+
+<file path=word/footer1.xml><?xml version="1.0" encoding="utf-8"?>
+<w:ftr xmlns:m="http://schemas.openxmlformats.org/officeDocument/2006/math" xmlns:mc="http://schemas.openxmlformats.org/markup-compatibility/2006" xmlns:mo="http://schemas.microsoft.com/office/mac/office/2008/main" xmlns:mv="urn:schemas-microsoft-com:mac:vml" xmlns:o="urn:schemas-microsoft-com:office:office" xmlns:r="http://schemas.openxmlformats.org/officeDocument/2006/relationships" xmlns:v="urn:schemas-microsoft-com:vml" xmlns:w10="urn:schemas-microsoft-com:office:word" xmlns:w14="http://schemas.microsoft.com/office/word/2010/wordml" xmlns:w="http://schemas.openxmlformats.org/wordprocessingml/2006/main" xmlns:wne="http://schemas.microsoft.com/office/word/2006/wordml" xmlns:wp14="http://schemas.microsoft.com/office/word/2010/wordprocessingDrawing" xmlns:wp="http://schemas.openxmlformats.org/drawingml/2006/wordprocessingDrawing" xmlns:wpc="http://schemas.microsoft.com/office/word/2010/wordprocessingCanvas" xmlns:wpg="http://schemas.microsoft.com/office/word/2010/wordprocessingGroup" xmlns:wpi="http://schemas.microsoft.com/office/word/2010/wordprocessingInk" xmlns:wps="http://schemas.microsoft.com/office/word/2010/wordprocessingShape" mc:Ignorable="w14 wp14">
+  <w:p>
+    <w:pPr>
+      <w:pStyle w:val="Footer"/>
+      <w:spacing w:before="0"/>
+      <w:jc w:val="right"/>
+    </w:pPr>
+    <w:r>
+      <w:rPr>
+        <w:rFonts w:ascii="Arial" w:hAnsi="Arial"/>
+        <w:color w:val="586069"/>
+        <w:sz w:val="16"/>
+      </w:rPr>
+      <w:t xml:space="preserve">Seite </w:t>
+    </w:r>
+    <w:r>
+      <w:rPr>
+        <w:rFonts w:ascii="Arial" w:hAnsi="Arial"/>
+        <w:color w:val="586069"/>
+        <w:sz w:val="16"/>
+      </w:rPr>
+      <w:fldChar w:fldCharType="begin"/>
+      <w:instrText xml:space="preserve"> PAGE </w:instrText>
+      <w:fldChar w:fldCharType="end"/>
+    </w:r>
+  </w:p>
+</w:ftr>
+</file>
+
+<file path=word/header1.xml><?xml version="1.0" encoding="utf-8"?>
+<w:hdr xmlns:m="http://schemas.openxmlformats.org/officeDocument/2006/math" xmlns:mc="http://schemas.openxmlformats.org/markup-compatibility/2006" xmlns:mo="http://schemas.microsoft.com/office/mac/office/2008/main" xmlns:mv="urn:schemas-microsoft-com:mac:vml" xmlns:o="urn:schemas-microsoft-com:office:office" xmlns:r="http://schemas.openxmlformats.org/officeDocument/2006/relationships" xmlns:v="urn:schemas-microsoft-com:vml" xmlns:w10="urn:schemas-microsoft-com:office:word" xmlns:w14="http://schemas.microsoft.com/office/word/2010/wordml" xmlns:w="http://schemas.openxmlformats.org/wordprocessingml/2006/main" xmlns:wne="http://schemas.microsoft.com/office/word/2006/wordml" xmlns:wp14="http://schemas.microsoft.com/office/word/2010/wordprocessingDrawing" xmlns:wp="http://schemas.openxmlformats.org/drawingml/2006/wordprocessingDrawing" xmlns:wpc="http://schemas.microsoft.com/office/word/2010/wordprocessingCanvas" xmlns:wpg="http://schemas.microsoft.com/office/word/2010/wordprocessingGroup" xmlns:wpi="http://schemas.microsoft.com/office/word/2010/wordprocessingInk" xmlns:wps="http://schemas.microsoft.com/office/word/2010/wordprocessingShape" mc:Ignorable="w14 wp14">
+  <w:p>
+    <w:pPr>
+      <w:pStyle w:val="Header"/>
+      <w:spacing w:after="0"/>
+      <w:jc w:val="right"/>
+    </w:pPr>
+    <w:r>
+      <w:rPr>
+        <w:rFonts w:ascii="Arial" w:hAnsi="Arial"/>
+        <w:color w:val="586069"/>
+        <w:sz w:val="16"/>
+      </w:rPr>
+      <w:t>Petersen &amp; Hagedorn Rechtsanwälte  |  PMH/26-184 AM</w:t>
+    </w:r>
+  </w:p>
+</w:hdr>
 </file>
 
 <file path=word/numbering.xml><?xml version="1.0" encoding="utf-8"?>
@@ -457,9 +592,13 @@
     <w:name w:val="Normal"/>
     <w:qFormat/>
     <w:rsid w:val="00FC693F"/>
+    <w:pPr>
+      <w:widowControl/>
+      <w:spacing w:before="0" w:after="120" w:line="276" w:lineRule="auto"/>
+    </w:pPr>
     <w:rPr>
-      <w:rFonts w:ascii="Times New Roman" w:hAnsi="Times New Roman"/>
-      <w:sz w:val="22"/>
+      <w:rFonts w:ascii="Arial" w:hAnsi="Arial"/>
+      <w:sz w:val="21"/>
     </w:rPr>
   </w:style>
   <w:style w:type="paragraph" w:styleId="Header">
@@ -517,15 +656,15 @@
     <w:pPr>
       <w:keepNext/>
       <w:keepLines/>
-      <w:spacing w:before="480" w:after="0"/>
+      <w:spacing w:before="240" w:after="120"/>
       <w:outlineLvl w:val="0"/>
     </w:pPr>
     <w:rPr>
-      <w:rFonts w:asciiTheme="majorHAnsi" w:eastAsiaTheme="majorEastAsia" w:hAnsiTheme="majorHAnsi" w:cstheme="majorBidi" w:ascii="Times New Roman" w:hAnsi="Times New Roman"/>
+      <w:rFonts w:asciiTheme="majorHAnsi" w:eastAsiaTheme="majorEastAsia" w:hAnsiTheme="majorHAnsi" w:cstheme="majorBidi" w:ascii="Arial" w:hAnsi="Arial"/>
       <w:b/>
       <w:bCs/>
-      <w:color w:val="365F91" w:themeColor="accent1" w:themeShade="BF"/>
-      <w:sz w:val="26"/>
+      <w:color w:val="17365D"/>
+      <w:sz w:val="25"/>
       <w:szCs w:val="28"/>
     </w:rPr>
   </w:style>
@@ -541,15 +680,15 @@
     <w:pPr>
       <w:keepNext/>
       <w:keepLines/>
-      <w:spacing w:before="200" w:after="0"/>
+      <w:spacing w:before="200" w:after="100"/>
       <w:outlineLvl w:val="1"/>
     </w:pPr>
     <w:rPr>
-      <w:rFonts w:asciiTheme="majorHAnsi" w:eastAsiaTheme="majorEastAsia" w:hAnsiTheme="majorHAnsi" w:cstheme="majorBidi" w:ascii="Times New Roman" w:hAnsi="Times New Roman"/>
+      <w:rFonts w:asciiTheme="majorHAnsi" w:eastAsiaTheme="majorEastAsia" w:hAnsiTheme="majorHAnsi" w:cstheme="majorBidi" w:ascii="Arial" w:hAnsi="Arial"/>
       <w:b/>
       <w:bCs/>
-      <w:color w:val="4F81BD" w:themeColor="accent1"/>
-      <w:sz w:val="24"/>
+      <w:color w:val="17365D"/>
+      <w:sz w:val="23"/>
       <w:szCs w:val="26"/>
     </w:rPr>
   </w:style>
@@ -565,15 +704,15 @@
     <w:pPr>
       <w:keepNext/>
       <w:keepLines/>
-      <w:spacing w:before="200" w:after="0"/>
+      <w:spacing w:before="160" w:after="80"/>
       <w:outlineLvl w:val="2"/>
     </w:pPr>
     <w:rPr>
-      <w:rFonts w:asciiTheme="majorHAnsi" w:eastAsiaTheme="majorEastAsia" w:hAnsiTheme="majorHAnsi" w:cstheme="majorBidi" w:ascii="Times New Roman" w:hAnsi="Times New Roman"/>
+      <w:rFonts w:asciiTheme="majorHAnsi" w:eastAsiaTheme="majorEastAsia" w:hAnsiTheme="majorHAnsi" w:cstheme="majorBidi" w:ascii="Arial" w:hAnsi="Arial"/>
       <w:b/>
       <w:bCs/>
-      <w:color w:val="4F81BD" w:themeColor="accent1"/>
-      <w:sz w:val="24"/>
+      <w:color w:val="17365D"/>
+      <w:sz w:val="21"/>
     </w:rPr>
   </w:style>
   <w:style w:type="paragraph" w:styleId="Heading4">
@@ -807,15 +946,16 @@
       <w:pBdr>
         <w:bottom w:val="single" w:sz="8" w:space="4" w:color="4F81BD" w:themeColor="accent1"/>
       </w:pBdr>
-      <w:spacing w:after="300" w:line="240" w:lineRule="auto"/>
+      <w:spacing w:after="200" w:line="240" w:lineRule="auto" w:before="160"/>
       <w:contextualSpacing/>
     </w:pPr>
     <w:rPr>
-      <w:rFonts w:asciiTheme="majorHAnsi" w:eastAsiaTheme="majorEastAsia" w:hAnsiTheme="majorHAnsi" w:cstheme="majorBidi"/>
-      <w:color w:val="17365D" w:themeColor="text2" w:themeShade="BF"/>
+      <w:rFonts w:asciiTheme="majorHAnsi" w:eastAsiaTheme="majorEastAsia" w:hAnsiTheme="majorHAnsi" w:cstheme="majorBidi" w:ascii="Arial" w:hAnsi="Arial"/>
+      <w:b/>
+      <w:color w:val="17365D"/>
       <w:spacing w:val="5"/>
       <w:kern w:val="28"/>
-      <w:sz w:val="52"/>
+      <w:sz w:val="30"/>
       <w:szCs w:val="52"/>
     </w:rPr>
   </w:style>

</xml_diff>